<commit_message>
manuscript: fix remaining evasion-count inconsistencies
Three places in manuscript_v2.md still described five documented blind spots
after the noise case was reclassified as correct silence, contradicting
Table 12 (four blind spots, one correct-silence case):

- Abstract: "documented blind spots ... (five)" -> "(four), with a further
  case in which required silence is correct behaviour rather than a miss".
- Conclusion: "five of eleven crafted evasions ... blind spots" -> four, with
  the fifth stated as correct silence.
- Evasion-suite discussion: the r1_noise_no_inner_ip case is now stated as a
  robustness result the released benchmark reports separately, not a blind
  spot.

Regenerated manuscript_v2.{html,docx}.
</commit_message>
<xml_diff>
--- a/paper/manuscript_v2.docx
+++ b/paper/manuscript_v2.docx
@@ -85,7 +85,7 @@
         <w:pStyle w:val="BodyText"/>
       </w:pPr>
       <w:r>
-        <w:t xml:space="preserve">The detector is evaluated on a seeded 1,320-packet labelled corpus whose 720 benign packets span twelve traffic categories, including two deliberately adversarial ones: non-IP Unstructured-PDU payloads crafted to collide with the detector's nested-tunnel heuristic, and legitimate Xn handovers that are structurally indistinguishable from TEID spoofing on the user plane alone. On this corpus the detector reaches precision 1.0, recall 1.0, F1 1.0 and a false-positive rate of 0.0, with zero standard deviation across five seeds, at a mean per-packet cost of 686 µs including packet dissection. Three further results accompany the headline score rather than replacing it: a naive baseline that differs only in omitting the payload re-parse misses 100% of nested tunnels (F1 0.889); a false-positive ablation traces every residual false alarm, six in 720 benign packets, to legitimate handovers and removes them with an operator-supplied gNB allowlist; and an eleven-case evasion suite states explicitly which crafted evasions the detector catches (six) and which are documented blind spots of a stateless user-plane-only rule (five). The same engine was then exercised against genuinely transmitted traffic from a live 5G core and radio simulator, where it raised 131 findings across all four rules with no crashes.</w:t>
+        <w:t xml:space="preserve">The detector is evaluated on a seeded 1,320-packet labelled corpus whose 720 benign packets span twelve traffic categories, including two deliberately adversarial ones: non-IP Unstructured-PDU payloads crafted to collide with the detector's nested-tunnel heuristic, and legitimate Xn handovers that are structurally indistinguishable from TEID spoofing on the user plane alone. On this corpus the detector reaches precision 1.0, recall 1.0, F1 1.0 and a false-positive rate of 0.0, with zero standard deviation across five seeds, at a mean per-packet cost of 686 µs including packet dissection. Three further results accompany the headline score rather than replacing it: a naive baseline that differs only in omitting the payload re-parse misses 100% of nested tunnels (F1 0.889); a false-positive ablation traces every residual false alarm, six in 720 benign packets, to legitimate handovers and removes them with an operator-supplied gNB allowlist; and an eleven-case evasion suite states explicitly which crafted evasions the detector catches (six) and which are documented blind spots of a stateless user-plane-only rule (four), with a further case in which required silence is correct behaviour rather than a miss. The same engine was then exercised against genuinely transmitted traffic from a live 5G core and radio simulator, where it raised 131 findings across all four rules with no crashes.</w:t>
       </w:r>
     </w:p>
     <w:p>
@@ -7349,7 +7349,22 @@
         <w:pStyle w:val="BodyText"/>
       </w:pPr>
       <w:r>
-        <w:t xml:space="preserve">The four blind spots are the honest cost of a stateless, user-plane-only, configuration-driven design, and they cluster in an informative way. R1 contributes none of them: it survives every structural mutation attempted against it, and its one expected non-detection, GTP-looking noise carrying no routable inner IP, is correct silence rather than a blind spot, consistent with a nested tunnel having no legitimate explanation on N3. R3 survives protocol substitution but not port relocation, because it keys on ports. R2's two blind spots are both consequences of using the source IP address as the identity of a tunnel endpoint, which a spoofer controls. R4's blind spot is purely a completeness property of operator configuration. Section 5 identifies the extensions that would close each.</w:t>
+        <w:t xml:space="preserve">The four blind spots are the honest cost of a stateless, user-plane-only, configuration-driven design, and they cluster in an informative way. R1 contributes none of them: it survives every structural mutation attempted against it, and its one expected non-detection, the case</w:t>
+      </w:r>
+      <w:r>
+        <w:t xml:space="preserve"> </w:t>
+      </w:r>
+      <w:r>
+        <w:rPr>
+          <w:rStyle w:val="VerbatimChar"/>
+        </w:rPr>
+        <w:t xml:space="preserve">r1_noise_no_inner_ip</w:t>
+      </w:r>
+      <w:r>
+        <w:t xml:space="preserve"> </w:t>
+      </w:r>
+      <w:r>
+        <w:t xml:space="preserve">(GTP-looking noise with no routable inner IP), is not a miss. The engine is required to stay silent on it and does, so it counts as a robustness result rather than a blind spot, and the released benchmark reports it separately. This is consistent with a nested tunnel having no legitimate explanation on N3. R3 survives protocol substitution but not port relocation, because it keys on ports. R2's two blind spots are both consequences of using the source IP address as the identity of a tunnel endpoint, which a spoofer controls. R4's blind spot is purely a completeness property of operator configuration. Section 5 identifies the extensions that would close each.</w:t>
       </w:r>
     </w:p>
     <w:p>
@@ -9274,7 +9289,7 @@
         <w:pStyle w:val="BodyText"/>
       </w:pPr>
       <w:r>
-        <w:t xml:space="preserve">The four-rule engine achieved precision, recall and F1 of 1.0 with a false-positive rate of 0.0 on a seeded 1,320-packet corpus whose 720 benign packets span twelve categories including two adversarial ones, with zero variance across five seeds and at a mean per-packet cost of 686 µs including dissection. Three measurements accompany that score and are the reason it should be believed rather than discounted: a naive baseline identical in every respect except the payload re-parse reaches F1 0.889 and misses 100% of nested tunnels; every false positive the detector produces in any configuration, six in 720 benign packets, is a legitimate handover and is removed by an operator-supplied gNB allowlist; and five of eleven crafted evasions succeed and are documented as blind spots rather than suppressed. The same engine raised 131 findings across all four rules on live traffic from a real Open5GS core and UERANSIM radio simulator.</w:t>
+        <w:t xml:space="preserve">The four-rule engine achieved precision, recall and F1 of 1.0 with a false-positive rate of 0.0 on a seeded 1,320-packet corpus whose 720 benign packets span twelve categories including two adversarial ones, with zero variance across five seeds and at a mean per-packet cost of 686 µs including dissection. Three measurements accompany that score and are the reason it should be believed rather than discounted: a naive baseline identical in every respect except the payload re-parse reaches F1 0.889 and misses 100% of nested tunnels; every false positive the detector produces in any configuration, six in 720 benign packets, is a legitimate handover and is removed by an operator-supplied gNB allowlist; and four of eleven crafted evasions succeed and are documented as blind spots rather than suppressed, while a fifth expected non-detection, GTP-looking noise with no routable inner IP, is correct silence rather than a miss. The same engine raised 131 findings across all four rules on live traffic from a real Open5GS core and UERANSIM radio simulator.</w:t>
       </w:r>
     </w:p>
     <w:p>

</xml_diff>

<commit_message>
docs: update test count 19 -> 21 and benign categories to twelve
Clean-room reproduction from a fresh clone surfaced that the docs still cited
the pre-regression test count. The suite is 21 tests (test_rules.py grew from
seven to nine when the G-PDU-outer regression tests were added).

- SETUP.md, README.md, paper/RESULTS.md, paper/REPRODUCE.md: 19 -> 21.
- paper/manuscript_v2.md: nineteen -> twenty-one, test_rules seven -> nine with
  the two new cases named; regenerated manuscript_v2.{html,docx}.
- SETUP.md: benign corpus "11 traffic types" -> twelve.
</commit_message>
<xml_diff>
--- a/paper/manuscript_v2.docx
+++ b/paper/manuscript_v2.docx
@@ -4412,7 +4412,7 @@
         <w:pStyle w:val="BodyText"/>
       </w:pPr>
       <w:r>
-        <w:t xml:space="preserve">Before evaluation, the detector's unit suite was executed and all nineteen tests passed across five files: one test per rule plus a benign-traffic negative case, a two-packet TEID-spoof sequence and a malformed-packet robustness check confirming that the dispatcher survives garbage input (</w:t>
+        <w:t xml:space="preserve">Before evaluation, the detector's unit suite was executed and all twenty-one tests passed across five files: one test per rule plus a benign-traffic negative case, a two-packet TEID-spoof sequence and a malformed-packet robustness check confirming that the dispatcher survives garbage input, and, added after a realistic-outer probe exposed the gap, a nested tunnel inside a valid G-PDU outer plus a benign G-PDU that must stay silent (</w:t>
       </w:r>
       <w:r>
         <w:rPr>
@@ -4421,7 +4421,7 @@
         <w:t xml:space="preserve">test_rules.py</w:t>
       </w:r>
       <w:r>
-        <w:t xml:space="preserve">, seven tests); zero false positives on the realistic benign corpus, attribution of every residual false positive without the gNB allowlist to handovers, and no flagging of Unstructured-PDU bytes across 200 adversarial payloads (</w:t>
+        <w:t xml:space="preserve">, nine tests); zero false positives on the realistic benign corpus, attribution of every residual false positive without the gNB allowlist to handovers, and no flagging of Unstructured-PDU bytes across 200 adversarial payloads (</w:t>
       </w:r>
       <w:r>
         <w:rPr>

</xml_diff>